<commit_message>
Update KAILA Founder Presentation materials and financial model
- Revised content in multiple presentation files to reflect updated product descriptions and financial projections.
- Adjusted funding scenarios and financial model to align with lean pilot approach and revised budget estimates.
- Enhanced clarity on market assumptions and pilot execution strategies in investor package documents.
- Updated startup guide to streamline the initial pilot process and emphasize the importance of validation before software development.
</commit_message>
<xml_diff>
--- a/KAILA_Founder_Grade_Package/01 Master Business Proposal.docx
+++ b/KAILA_Founder_Grade_Package/01 Master Business Proposal.docx
@@ -24390,6 +24390,24 @@
         </w:rPr>
       </w:pPr>
       <w:r>
+        <w:t>•Cellphone repair: screen, battery, charging port, speaker, camera, and basic software issues.</w:t>
+      </w:r>
+    </w:p>
+    <w:p>
+      <w:pPr>
+        <w:widowControl/>
+        <w:spacing w:before="190" w:line="186" w:lineRule="exact"/>
+        <w:ind w:left="557" w:firstLine="1"/>
+        <w:rPr>
+          <w:rFonts w:ascii="Arial" w:eastAsia="Arial" w:hAnsi="Arial" w:cs="Arial"/>
+          <w:noProof/>
+          <w:color w:val="000000"/>
+          <w:spacing w:val="-14"/>
+          <w:sz w:val="19"/>
+          <w:szCs w:val="19"/>
+        </w:rPr>
+      </w:pPr>
+      <w:r>
         <w:rPr>
           <w:rFonts w:ascii="Arial" w:eastAsia="Arial" w:hAnsi="Arial" w:cs="Arial"/>
           <w:noProof/>
@@ -46156,7 +46174,7 @@
         <w:rPr>
           <w:sz w:val="18"/>
         </w:rPr>
-        <w:t>A manual version of the marketplace run with simple tools such as forms, spreadsheets, Facebook, and Messenger before building the full app.</w:t>
+        <w:t>A marketplace test using the existing browser MVP/native wrapper plus Facebook page posts, Messenger follow-up, and manual operations support.</w:t>
       </w:r>
     </w:p>
     <w:p>

</xml_diff>